<commit_message>
Regenerate apple tester test plan with lowercase brand wording
</commit_message>
<xml_diff>
--- a/downloads/knokkeroo-tester-test-plan-apple.docx
+++ b/downloads/knokkeroo-tester-test-plan-apple.docx
@@ -141,7 +141,7 @@
           </w:tcPr>
           <w:p>
             <w:r>
-              <w:t>30 July 2026</w:t>
+              <w:t>31 July 2026</w:t>
             </w:r>
           </w:p>
         </w:tc>
@@ -1591,7 +1591,7 @@
               <w:rPr>
                 <w:sz w:val="18"/>
               </w:rPr>
-              <w:t>Knok updates last-checked-in time immediately.</w:t>
+              <w:t>knok updates last-checked-in time immediately.</w:t>
               <w:br/>
               <w:t>Preconditions: logged in, on the home screen.</w:t>
             </w:r>
@@ -1608,7 +1608,7 @@
               </w:rPr>
               <w:t>1. Tap your own Me tile.</w:t>
               <w:br/>
-              <w:t>2. Tap Knok.</w:t>
+              <w:t>2. Tap knok.</w:t>
               <w:br/>
               <w:t>3. Return to the home screen.</w:t>
             </w:r>
@@ -1724,7 +1724,7 @@
               <w:rPr>
                 <w:sz w:val="18"/>
               </w:rPr>
-              <w:t>Home Screen quick action triggers a Knok.</w:t>
+              <w:t>Home Screen quick action triggers a knok.</w:t>
               <w:br/>
               <w:t>Preconditions: app installed, signed in at least once.</w:t>
             </w:r>
@@ -1741,7 +1741,7 @@
               </w:rPr>
               <w:t>1. Long-press the knokkeroo app icon on the iPhone Home Screen.</w:t>
               <w:br/>
-              <w:t>2. Tap the "Knok now" quick action.</w:t>
+              <w:t>2. Tap the "knok now" quick action.</w:t>
             </w:r>
           </w:p>
         </w:tc>
@@ -1767,7 +1767,7 @@
               <w:rPr>
                 <w:sz w:val="18"/>
               </w:rPr>
-              <w:t>A Knok is recorded without opening the app; reopening the app shows the updated time.</w:t>
+              <w:t>A knok is recorded without opening the app; reopening the app shows the updated time.</w:t>
             </w:r>
           </w:p>
         </w:tc>
@@ -2166,7 +2166,7 @@
               <w:rPr>
                 <w:sz w:val="18"/>
               </w:rPr>
-              <w:t>Watch app shows status and can Knok.</w:t>
+              <w:t>Watch app shows status and can knok.</w:t>
               <w:br/>
               <w:t>Preconditions: REG-2 complete, signed in on the iPhone, plan is paid or beta.</w:t>
             </w:r>
@@ -2185,7 +2185,7 @@
               <w:br/>
               <w:t>2. Confirm your own status is shown.</w:t>
               <w:br/>
-              <w:t>3. Tap Knok on the Watch.</w:t>
+              <w:t>3. Tap knok on the Watch.</w:t>
             </w:r>
           </w:p>
         </w:tc>
@@ -2211,7 +2211,7 @@
               <w:rPr>
                 <w:sz w:val="18"/>
               </w:rPr>
-              <w:t>Watch shows current status; tapping Knok records a check-in and the Watch UI confirms it.</w:t>
+              <w:t>Watch shows current status; tapping knok records a check-in and the Watch UI confirms it.</w:t>
             </w:r>
           </w:p>
         </w:tc>
@@ -2299,7 +2299,7 @@
               <w:rPr>
                 <w:sz w:val="18"/>
               </w:rPr>
-              <w:t>Watch Knok reflects on the phone without reopening the app.</w:t>
+              <w:t>Watch knok reflects on the phone without reopening the app.</w:t>
               <w:br/>
               <w:t>Preconditions: WA-1 complete.</w:t>
             </w:r>
@@ -2314,7 +2314,7 @@
               <w:rPr>
                 <w:sz w:val="18"/>
               </w:rPr>
-              <w:t>1. From the Watch, tap Knok.</w:t>
+              <w:t>1. From the Watch, tap knok.</w:t>
               <w:br/>
               <w:t>2. On the iPhone, open the app.</w:t>
             </w:r>
@@ -3005,7 +3005,7 @@
               <w:rPr>
                 <w:sz w:val="18"/>
               </w:rPr>
-              <w:t>TV Knok via the paired device.</w:t>
+              <w:t>TV knok via the paired device.</w:t>
               <w:br/>
               <w:t>Preconditions: TV-2 complete (TV is paired).</w:t>
             </w:r>
@@ -3046,7 +3046,7 @@
               <w:rPr>
                 <w:sz w:val="18"/>
               </w:rPr>
-              <w:t>A Knok is recorded; the phone app's Me tile updates to reflect the new time. Apple TV knoks are free (not gated behind a paid plan).</w:t>
+              <w:t>A knok is recorded; the phone app's Me tile updates to reflect the new time. Apple TV knoks are free (not gated behind a paid plan).</w:t>
             </w:r>
           </w:p>
         </w:tc>

</xml_diff>

<commit_message>
Apple tester test plan: REG-1 and REG-3 now say the join link must be opened on an iPhone
</commit_message>
<xml_diff>
--- a/downloads/knokkeroo-tester-test-plan-apple.docx
+++ b/downloads/knokkeroo-tester-test-plan-apple.docx
@@ -390,7 +390,7 @@
               </w:rPr>
               <w:t>Install TestFlight and join the beta.</w:t>
               <w:br/>
-              <w:t>Preconditions: an iPhone on iOS 16.4+, an Apple ID signed into the App Store.</w:t>
+              <w:t>Preconditions: an iPhone on iOS 16.4+, an Apple ID signed into the App Store. The join link must be opened ON THE IPHONE — it only completes inside the TestFlight app, and a desktop browser shows an information page with no Accept button.</w:t>
             </w:r>
           </w:p>
         </w:tc>
@@ -403,11 +403,11 @@
               <w:rPr>
                 <w:sz w:val="18"/>
               </w:rPr>
-              <w:t>1. Open https://testflight.apple.com/join/XaabanK9 on the iPhone.</w:t>
+              <w:t>1. Install TestFlight from the App Store on the iPhone.</w:t>
               <w:br/>
-              <w:t>2. Install TestFlight from the App Store if prompted.</w:t>
+              <w:t>2. ON THE IPHONE, open https://testflight.apple.com/join/XaabanK9 (or open TestFlight, tap Redeem, and enter the code XaabanK9).</w:t>
               <w:br/>
-              <w:t>3. Return to the join link and tap Accept/Install.</w:t>
+              <w:t>3. Tap Accept, then Install.</w:t>
             </w:r>
           </w:p>
         </w:tc>
@@ -433,7 +433,7 @@
               <w:rPr>
                 <w:sz w:val="18"/>
               </w:rPr>
-              <w:t>knokkeroo (build 4.30.2 / 31) installs via TestFlight and launches.</w:t>
+              <w:t>knokkeroo (build 4.30.3 / 32) installs via TestFlight and launches.</w:t>
             </w:r>
           </w:p>
         </w:tc>
@@ -1016,7 +1016,7 @@
               </w:rPr>
               <w:t>Join the separate Apple TV beta.</w:t>
               <w:br/>
-              <w:t>Preconditions: an Apple TV (tvOS 16+), TestFlight installed on the Apple TV itself (or invited via the same Apple ID on another device per Apple's cross-device TestFlight flow).</w:t>
+              <w:t>Preconditions: an Apple TV (tvOS 16+) and an iPhone signed into THE SAME Apple ID. The join step CANNOT be done on the Apple TV — tvOS cannot open a web link — and cannot be done on a computer. You join with an Apple ID, not a device, which is what carries the beta to the TV.</w:t>
             </w:r>
           </w:p>
         </w:tc>
@@ -1029,9 +1029,11 @@
               <w:rPr>
                 <w:sz w:val="18"/>
               </w:rPr>
-              <w:t>1. On the Apple TV (or a paired iPhone/iPad signed into the same Apple ID), open https://testflight.apple.com/join/72H1DdnT.</w:t>
+              <w:t>1. ON THE IPHONE, open https://testflight.apple.com/join/72H1DdnT (or open TestFlight, tap Redeem, and enter the code 72H1DdnT).</w:t>
               <w:br/>
-              <w:t>2. Accept the invite and install knokkeroo TV.</w:t>
+              <w:t>2. Tap Accept.</w:t>
+              <w:br/>
+              <w:t>3. On the Apple TV, open TestFlight (install it from the tvOS App Store if absent) and install knokkeroo TV.</w:t>
             </w:r>
           </w:p>
         </w:tc>

</xml_diff>